<commit_message>
Apply .md content fixes to 4 framework docx: UR5 de-dup rewrite + remove ISO 13849-1 (+renumber gap in the 3 clean framework docx); docx keep their own framework numbering
</commit_message>
<xml_diff>
--- a/08_组员资料/成员4_Part4_交付/ID-Coo_报告提交框架_EN_R10润色_引用核对版.docx
+++ b/08_组员资料/成员4_Part4_交付/ID-Coo_报告提交框架_EN_R10润色_引用核对版.docx
@@ -3334,12 +3334,12 @@
           </w:p>
           <w:p>
             <w:r>
-              <w:t>Safety functions and required performance levels follow a site risk assessment using ISO 13849-1 [24]; no achieved level is claimed. Mechanical guards and validated obstruction responses protect the gates. Ultrasonic points alone cannot provide anti-pinch protection.</w:t>
+              <w:t>Safety functions and required performance levels follow a site risk assessment using general functional-safety methods; no achieved level is claimed. Mechanical guards and validated obstruction responses protect the gates. Ultrasonic points alone cannot provide anti-pinch protection.</w:t>
             </w:r>
           </w:p>
           <w:p>
             <w:r>
-              <w:t>On power loss, hazardous movement stops and each gate holds a defined state; a short backup saves the event and signals the fault. Staff can release cattle from outside. On restart, the controller verifies gate positions and occupancy rather than resuming interrupted motion. Training and inspection follow HSE guidance [25]. (UR4, UR5)</w:t>
+              <w:t>On power loss, hazardous movement stops and each gate holds a defined state; a short backup saves the event and signals the fault. Staff can release cattle from outside. On restart, the controller verifies gate positions and occupancy rather than resuming interrupted motion. Training and inspection follow HSE guidance [24]. (UR4, UR5)</w:t>
             </w:r>
           </w:p>
           <w:tbl>
@@ -5320,7 +5320,7 @@
           </w:p>
           <w:p>
             <w:r>
-              <w:t>Version 1 stores records locally and exports them for audit; direct LIS access is not assumed. If specifications and authorisation become available, an adapter will separate internal passages from reportable movements, validate fields, retain submissions and receipts, prevent duplicates, and reconcile after outages [1], [8], [26].</w:t>
+              <w:t>Version 1 stores records locally and exports them for audit; direct LIS access is not assumed. If specifications and authorisation become available, an adapter will separate internal passages from reportable movements, validate fields, retain submissions and receipts, prevent duplicates, and reconcile after outages [1], [8], [25].</w:t>
             </w:r>
             <w:proofErr w:type="spellStart"/>
             <w:r/>
@@ -6705,7 +6705,7 @@
         <w:rPr>
           <w:sz w:val="18"/>
         </w:rPr>
-        <w:t>[24] International Organization for Standardization, “Safety of machinery—Safety-related parts of control systems—Part 1: General principles for design,” ISO 13849-1:2023, 2023. [Online]. Available: https://www.iso.org/standard/73481.html. Accessed: Oct. 15, 2026.</w:t>
+        <w:t>[24] Health and Safety Executive, “Livestock,” n.d. [Online]. Available: https://www.hse.gov.uk/agriculture/topics/livestock.htm. Accessed: Oct. 15, 2026.</w:t>
       </w:r>
     </w:p>
     <w:p>
@@ -6718,20 +6718,7 @@
         <w:rPr>
           <w:sz w:val="18"/>
         </w:rPr>
-        <w:t>[25] Health and Safety Executive, “Livestock,” n.d. [Online]. Available: https://www.hse.gov.uk/agriculture/topics/livestock.htm. Accessed: Oct. 15, 2026.</w:t>
-      </w:r>
-    </w:p>
-    <w:p>
-      <w:pPr>
-        <w:keepLines/>
-        <w:spacing w:after="100" w:line="240" w:lineRule="auto"/>
-        <w:ind w:left="461" w:hanging="461"/>
-      </w:pPr>
-      <w:r>
-        <w:rPr>
-          <w:sz w:val="18"/>
-        </w:rPr>
-        <w:t>[26] British Cattle Movement Service and Rural Payments Agency, “Keep a holding register for cattle to record births, movements and deaths,” GOV.UK, Jun. 28, 2023. [Online]. Available: https://www.gov.uk/guidance/keep-a-holding-register-for-cattle. Accessed: Oct. 15, 2026.</w:t>
+        <w:t>[25] British Cattle Movement Service and Rural Payments Agency, “Keep a holding register for cattle to record births, movements and deaths,” GOV.UK, Jun. 28, 2023. [Online]. Available: https://www.gov.uk/guidance/keep-a-holding-register-for-cattle. Accessed: Oct. 15, 2026.</w:t>
       </w:r>
     </w:p>
     <w:sectPr>

</xml_diff>